<commit_message>
Ch23 round 2: the Dhammapala flinches at forty days; frozen paper price; the table said yes
Co-Authored-By: Claude Opus 5.5 <noreply@anthropic.com>
</commit_message>
<xml_diff>
--- a/claude-notes/manuscript-v2/23-the-leak-merged.docx
+++ b/claude-notes/manuscript-v2/23-the-leak-merged.docx
@@ -93,7 +93,7 @@
           <w:i w:val="0"/>
           <w:strike w:val="0"/>
         </w:rPr>
-        <w:t>She had a sheet of paper in each hand and a pencil crosswise in her teeth, and she was looking down at the floor, where more paper lay in long pale strips from the wall almost to the door. One sock was grey. The other had been darned at the heel with green thread, a lot of green thread, by someone who had given up on matching. The afternoon came down the mirror shaft behind her, pale and a few seconds late, and lit her from above like a figure on a plinth.</w:t>
+        <w:t>She had a sheet of paper in each hand and a pencil crosswise in her teeth, and she was looking down at the floor, where more paper lay in long pale strips from the wall almost to the door. One sock was grey. The other had been darned at the heel with green thread, a lot of green thread, by someone who had given up on matching. The last of the light came down the mirror shaft behind her, pale and a few seconds late, and lit her from above.</w:t>
       </w:r>
     </w:p>
     <w:p>
@@ -103,7 +103,7 @@
           <w:i w:val="0"/>
           <w:strike w:val="0"/>
         </w:rPr>
-        <w:t>Elara stopped on the threshold. The last time she'd seen this woman, she'd been a back and a moving pencil and a voice that didn't look up. That was weeks ago. Everything since had come to Elara through Rohan, on folded paper, in his upright hand.</w:t>
+        <w:t>Elara stopped on the threshold. The last time she'd seen this woman, she'd been a back and a moving pencil and a voice that didn't look up. That was weeks ago. Everything since had come to Elara through Rohan, on folded paper, in his upright hand. Two nights since the Ancient One had turned Kubera's mark in the stone, and no word had come down from it.</w:t>
       </w:r>
     </w:p>
     <w:p>
@@ -123,7 +123,7 @@
           <w:i w:val="0"/>
           <w:strike w:val="0"/>
         </w:rPr>
-        <w:t>"I did." Rohan shut the door behind them. "The slow way ended with Baju. So does this rule."</w:t>
+        <w:t>"I did." Rohan shut the door behind them. "Keeping you apart was the careful way. It ended with Baju. So does this rule."</w:t>
       </w:r>
     </w:p>
     <w:p>
@@ -193,7 +193,7 @@
           <w:i w:val="0"/>
           <w:strike w:val="0"/>
         </w:rPr>
-        <w:t>"Then you want all four houses," Nayan said. She came down off the table by way of a chair, landing on the balls of her feet between two columns. "A gift leaves one book and lands in another. You can't see it in either book alone. I've been copying these six years." She tapped the nearest strip with her toe, very lightly, without moving it. "I've never once put them next to each other."</w:t>
+        <w:t>"Then you want all four houses," Nayan said. She came down off the table by way of a chair, landing on the balls of her feet between two columns. "A gift leaves one book and lands in another. You can't see it in either book alone. I've been copying these six years." She tapped the nearest strip with her toe, very lightly, without moving it. "I've never had a floor I could lay them out on behind a locked door."</w:t>
       </w:r>
     </w:p>
     <w:p>
@@ -233,7 +233,7 @@
           <w:i w:val="0"/>
           <w:strike w:val="0"/>
         </w:rPr>
-        <w:t>"Public books are public. Nobody minds a woman with a pencil. They mind a terminal that asks." Nayan handed her a pencil. "Your hand's gifts are recent. Start at the wall."</w:t>
+        <w:t>"Public books are public. Nobody minds a woman with a pencil. They mind a terminal that asks." Nayan handed her a pencil. "The hand's gifts are recent. Start at the wall."</w:t>
       </w:r>
     </w:p>
     <w:p>
@@ -253,7 +253,7 @@
           <w:i w:val="0"/>
           <w:strike w:val="0"/>
         </w:rPr>
-        <w:t>It was slow work, and knee work. Elara found the library money first because she knew its shape. In Kubera's column it left the Continuity Reserve on a date she could have recited in her sleep. In Drona's column, four sheets over and on the same date, it arrived as shelving, scaffolding, the restricted wing. Nayan found the Annex in the Chanakya column without being told where to look, and Rohan, on his heels at the end of the Ashoka strip, found the mandate review's first funded postings and laid a pencil across them so they wouldn't be lost again.</w:t>
+        <w:t>It was slow work, and knee work. Elara found the library money first because she knew its shape. In Kubera's column it left the Continuity Reserve on a date she could have recited in her sleep. In Drona's column, three columns over and on the same date, it arrived as shelving, scaffolding, the restricted wing. Nayan found the Annex in the Chanakya column without being told where to look, and Rohan, on his heels at the end of the Ashoka strip, found the mandate review's first funded postings and laid a pencil across them so they wouldn't be lost again.</w:t>
       </w:r>
     </w:p>
     <w:p>
@@ -562,7 +562,7 @@
           <w:i w:val="0"/>
           <w:strike w:val="0"/>
         </w:rPr>
-        <w:t>"Further than I do." Nayan didn't look pleased about it. "By the shape of it, a long way further. Look." She ran her pencil down the Kubera column without touching the paper. "Lamp oil's doubled in six years. Bearings, nearly. Everything in this city costs more than it did. Every other line on these pages has grown." The pencil stopped. "Forty reams, six years running. This one has never asked for one sheet more."</w:t>
+        <w:t>"Further than I do." Nayan didn't look pleased about it. "By the shape of it, a long way further. Look." She ran her pencil down the Kubera column without touching the paper. "Lamp oil's doubled in six years. Bearings, nearly. Everything in this city costs more than it did. Every other line on these pages has grown." The pencil stopped. "Forty reams, six years running, at the same sum on my first page as on yesterday's. Paper's up by half. Somebody is still paying what paper cost before any of us were born."</w:t>
       </w:r>
     </w:p>
     <w:p>
@@ -572,7 +572,7 @@
           <w:i w:val="0"/>
           <w:strike w:val="0"/>
         </w:rPr>
-        <w:t>Elara looked from the oldest page to the newest, from the door to the wall. The hand's gifts lay near the wall, three of them, recent and swelling, each one larger and louder than the one before. The other line ran the whole length of the floor, the same size at both ends, steady as a pulse taken in a sleeping body.</w:t>
+        <w:t>Elara looked from the oldest page to the newest, from the door to the wall. The hand's gifts lay near the wall, three of them, recent and swelling, each one larger and louder than the one before. The other line ran the whole length of the floor, the same sum at both ends.</w:t>
       </w:r>
     </w:p>
     <w:p>
@@ -622,7 +622,7 @@
           <w:i w:val="0"/>
           <w:strike w:val="0"/>
         </w:rPr>
-        <w:t>He was still on his heels at the end of the Ashoka strip, his pad on his knee, and he had gone still, the mat stillness. His eyes weren't on the paper. They were on nothing, a little above it.</w:t>
+        <w:t>He was still on his heels at the end of the Ashoka strip, his pad on his knee, and he had gone still, the stillness he wore on the mat. His eyes weren't on the paper. They were on nothing, a little above it.</w:t>
       </w:r>
     </w:p>
     <w:p>
@@ -702,7 +702,7 @@
           <w:i w:val="0"/>
           <w:strike w:val="0"/>
         </w:rPr>
-        <w:t>"Kaan," he said, for the room. Then he read it aloud, as if reading it aloud were the only way to make it lawful. "</w:t>
+        <w:t>"Kaan," he said, for the room. Then he read it aloud. "</w:t>
       </w:r>
       <w:r>
         <w:rPr>
@@ -846,7 +846,7 @@
           <w:i w:val="0"/>
           <w:strike w:val="0"/>
         </w:rPr>
-        <w:t>He gave it to her in order, with nothing added, as Ashoka taught its officers to report. Four columns. Six years. The hand's gifts at the wall end, three of them, growing. Then the other line. Every forty days, in all four houses' books in the same week. Bearings, filters, dressings, paper. Small sums. Carried on a founding mark no clerk could sign. Bought, and paid for, and never arriving anywhere a house would use them. The same size on the first page ever copied as on the last, though everything else in the city had grown.</w:t>
+        <w:t>He gave it to her in order, with nothing added, as Ashoka taught its officers to report. When he reached forty days, her fingers uncurled on her knees.</w:t>
       </w:r>
     </w:p>
     <w:p>
@@ -942,7 +942,7 @@
           <w:i w:val="0"/>
           <w:strike w:val="0"/>
         </w:rPr>
-        <w:t>"I told you I would tell you what I could." Her hands lay on her knees, the fingers curled. "So hear this, and only this. There is one table where the four Grandmasters sit together. Once in a year, no more. We are taken to it. None of us is told the way. But it can be asked to sit out of season, and this week it has been asked. The asking was not mine." A small pause, and her face didn't change across it. "I will carry what you found into that room. It will be answered."</w:t>
+        <w:t>"I told you I would tell you what I could." Her hands lay on her knees again, the fingers curled. "So hear this, and only this. There is a table the four Grandmasters are taken to once a year. This week it was asked to sit out of season, and it has said yes. The asking was not mine." A small pause, and her face didn't change across it. "I will carry what you found into that room. It will be answered."</w:t>
       </w:r>
     </w:p>
     <w:p>
@@ -1012,7 +1012,7 @@
           <w:i w:val="0"/>
           <w:strike w:val="0"/>
         </w:rPr>
-        <w:t>"A tired door begins to want the axe. It tells itself the breaking would be a rest." "Do not let it tell you that. You are not finished being opened and closed."</w:t>
+        <w:t>"A tired door begins to want the axe. It tells itself the breaking would be a rest. Do not let it tell you that. You are not finished being opened and closed."</w:t>
       </w:r>
     </w:p>
     <w:p>

</xml_diff>

<commit_message>
Ch23 round 3: 'Sleep before you decide'; Kaan's slip; the price line; trims
Co-Authored-By: Claude Opus 5.5 <noreply@anthropic.com>
</commit_message>
<xml_diff>
--- a/claude-notes/manuscript-v2/23-the-leak-merged.docx
+++ b/claude-notes/manuscript-v2/23-the-leak-merged.docx
@@ -421,7 +421,7 @@
           <w:i w:val="0"/>
           <w:strike w:val="0"/>
         </w:rPr>
-        <w:t>"Worse. The library money came through the Reserve, with two letters at the bottom. This has no letters at all. The book carries it the way it carries the house's own name." Nayan sat back on her heels. "And look at the sums."</w:t>
+        <w:t>"Worse. The library money came through the Reserve, with two letters at the bottom. This has no letters at all. It's printed, in the same ink as the house's name at the top of the page." Nayan sat back on her heels. "And look at the sums."</w:t>
       </w:r>
     </w:p>
     <w:p>
@@ -542,7 +542,7 @@
           <w:i w:val="0"/>
           <w:strike w:val="0"/>
         </w:rPr>
-        <w:t>It was there on the first page. It was older than Nayan's copying.</w:t>
+        <w:t>It was there on the first page. The line didn't start there. It ran off the edge of it.</w:t>
       </w:r>
     </w:p>
     <w:p>
@@ -562,7 +562,7 @@
           <w:i w:val="0"/>
           <w:strike w:val="0"/>
         </w:rPr>
-        <w:t>"Further than I do." Nayan didn't look pleased about it. "By the shape of it, a long way further. Look." She ran her pencil down the Kubera column without touching the paper. "Lamp oil's doubled in six years. Bearings, nearly. Everything in this city costs more than it did. Every other line on these pages has grown." The pencil stopped. "Forty reams, six years running, at the same sum on my first page as on yesterday's. Paper's up by half. Somebody is still paying what paper cost before any of us were born."</w:t>
+        <w:t>"Further than I do." Nayan didn't look pleased about it. "By the shape of it, a long way further. Look." She ran her pencil down the Kubera column without touching the paper. "Lamp oil's doubled in six years. Bearings, nearly. Everything in this city costs more than it did. Every other line on these pages has grown." The pencil stopped. "Forty reams, six years running, at the same sum on my first page as on yesterday's. Paper's up by half. Somebody set that price before I ever picked up a pencil, and in six years nobody has corrected it."</w:t>
       </w:r>
     </w:p>
     <w:p>
@@ -572,7 +572,7 @@
           <w:i w:val="0"/>
           <w:strike w:val="0"/>
         </w:rPr>
-        <w:t>Elara looked from the oldest page to the newest, from the door to the wall. The hand's gifts lay near the wall, three of them, recent and swelling, each one larger and louder than the one before. The other line ran the whole length of the floor, the same sum at both ends.</w:t>
+        <w:t>Elara looked from the oldest page to the newest, from the door to the wall. The hand's gifts lay near the wall, three of them, recent and swelling. The other line ran the whole length of the floor, the same sum at both ends.</w:t>
       </w:r>
     </w:p>
     <w:p>
@@ -582,7 +582,7 @@
           <w:i w:val="0"/>
           <w:strike w:val="0"/>
         </w:rPr>
-        <w:t>"The hand feeds," she said. "This one eats. Just enough. For a very long time."</w:t>
+        <w:t>"The hand feeds," she said. "This one eats."</w:t>
       </w:r>
     </w:p>
     <w:p>
@@ -592,7 +592,7 @@
           <w:i w:val="0"/>
           <w:strike w:val="0"/>
         </w:rPr>
-        <w:t>Her fingers had gone cold on the paper. She was thinking, against her own instructions, of a grey wall under the archive and a column at its right-hand edge with nothing in its location field. No house. No floor. She looked at the receiving lists in Nayan's hand, at all the places the dressings and the bearings didn't arrive, and she set the old Drona page back down exactly where it had been, square to its neighbors, and said nothing at all.</w:t>
+        <w:t>Her fingers had gone cold on the paper. She was thinking, though she could never say it here, of a grey wall under the archive and a column at its right-hand edge with nothing in its location field. No house. No floor. She looked at the receiving lists in Nayan's hand, at all the places the dressings and the bearings didn't arrive, and she set the old Drona page back down exactly where it had been, square to its neighbors, and said nothing at all.</w:t>
       </w:r>
     </w:p>
     <w:p>
@@ -746,7 +746,7 @@
           <w:i/>
           <w:strike w:val="0"/>
         </w:rPr>
-        <w:t>He brought an old file. He holds it. He won't say what is in it.</w:t>
+        <w:t>He brought an old file. He keeps it shut on his knee.</w:t>
       </w:r>
     </w:p>
     <w:p>
@@ -922,7 +922,7 @@
           <w:i w:val="0"/>
           <w:strike w:val="0"/>
         </w:rPr>
-        <w:t>"Good." She looked at the lamp, not at him. "You have done what I asked of you, and it was the harder thing. Most hunters cannot leave a trail lying in the road."</w:t>
+        <w:t>"Good." She looked at the lamp, not at him. "You have done what I asked of you, and it was the harder thing."</w:t>
       </w:r>
     </w:p>
     <w:p>
@@ -1012,7 +1012,7 @@
           <w:i w:val="0"/>
           <w:strike w:val="0"/>
         </w:rPr>
-        <w:t>"A tired door begins to want the axe. It tells itself the breaking would be a rest. Do not let it tell you that. You are not finished being opened and closed."</w:t>
+        <w:t>"Sleep before you decide anything you have not told me."</w:t>
       </w:r>
     </w:p>
     <w:p>

</xml_diff>

<commit_message>
Ch23: open with Ravi meeting Kaan in Room Four (N5), before the slip reports it
Co-Authored-By: Claude Opus 5.5 <noreply@anthropic.com>
</commit_message>
<xml_diff>
--- a/claude-notes/manuscript-v2/23-the-leak-merged.docx
+++ b/claude-notes/manuscript-v2/23-the-leak-merged.docx
@@ -44,6 +44,136 @@
           <w:color w:val="000000"/>
         </w:rPr>
         <w:t>Then and now: The leak</w:t>
+      </w:r>
+    </w:p>
+    <w:p>
+      <w:r>
+        <w:rPr>
+          <w:b w:val="0"/>
+          <w:i w:val="0"/>
+          <w:strike w:val="0"/>
+        </w:rPr>
+        <w:t>The morning after Room Four had stood empty, Ravi went back at the same hour with the folio inside his coat.</w:t>
+      </w:r>
+    </w:p>
+    <w:p>
+      <w:r>
+        <w:rPr>
+          <w:b w:val="0"/>
+          <w:i w:val="0"/>
+          <w:strike w:val="0"/>
+        </w:rPr>
+        <w:t>This time the chair facing the door was taken.</w:t>
+      </w:r>
+    </w:p>
+    <w:p>
+      <w:r>
+        <w:rPr>
+          <w:b w:val="0"/>
+          <w:i w:val="0"/>
+          <w:strike w:val="0"/>
+        </w:rPr>
+        <w:t>A porter. Grey sleeves, a nick white through one eyebrow, a face that gave nothing to remember. The trolley he'd been pushing waited out in the corridor with its brake on. He didn't get up. He looked at the flat shape under the left side of Ravi's coat, and then at the other chair.</w:t>
+      </w:r>
+    </w:p>
+    <w:p>
+      <w:r>
+        <w:rPr>
+          <w:b w:val="0"/>
+          <w:i w:val="0"/>
+          <w:strike w:val="0"/>
+        </w:rPr>
+        <w:t>Ravi sat. He took the folio out and laid it on his knee, closed, and kept his hand flat on the card.</w:t>
+      </w:r>
+    </w:p>
+    <w:p>
+      <w:r>
+        <w:rPr>
+          <w:b w:val="0"/>
+          <w:i w:val="0"/>
+          <w:strike w:val="0"/>
+        </w:rPr>
+        <w:t>He'd walked three ways into this conversation in the dark, each with a door out of it. None of them started here, across a bare table from a man who hadn't asked him anything.</w:t>
+      </w:r>
+    </w:p>
+    <w:p>
+      <w:r>
+        <w:rPr>
+          <w:b w:val="0"/>
+          <w:i w:val="0"/>
+          <w:strike w:val="0"/>
+        </w:rPr>
+        <w:t>"You put the slip in my coat," he said. "And the binder in my arms."</w:t>
+      </w:r>
+    </w:p>
+    <w:p>
+      <w:r>
+        <w:rPr>
+          <w:b w:val="0"/>
+          <w:i w:val="0"/>
+          <w:strike w:val="0"/>
+        </w:rPr>
+        <w:t>The porter didn't answer. Ravi had sat across from Chanakya's best questioners for three years, and every one of them had, at some point, leaned forward. This man didn't. Ravi heard himself start to fill the silence, and stopped, and it was the stopping the porter seemed to listen to.</w:t>
+      </w:r>
+    </w:p>
+    <w:p>
+      <w:r>
+        <w:rPr>
+          <w:b w:val="0"/>
+          <w:i w:val="0"/>
+          <w:strike w:val="0"/>
+        </w:rPr>
+        <w:t>"I'm not opening it," Ravi said.</w:t>
+      </w:r>
+    </w:p>
+    <w:p>
+      <w:r>
+        <w:rPr>
+          <w:b w:val="0"/>
+          <w:i w:val="0"/>
+          <w:strike w:val="0"/>
+        </w:rPr>
+        <w:t>The porter's eyes went to the folio and came back. He didn't ask what was in it.</w:t>
+      </w:r>
+    </w:p>
+    <w:p>
+      <w:r>
+        <w:rPr>
+          <w:b w:val="0"/>
+          <w:i w:val="0"/>
+          <w:strike w:val="0"/>
+        </w:rPr>
+        <w:t>"When you do," he said, "open it for someone who will read it aloud."</w:t>
+      </w:r>
+    </w:p>
+    <w:p>
+      <w:r>
+        <w:rPr>
+          <w:b w:val="0"/>
+          <w:i w:val="0"/>
+          <w:strike w:val="0"/>
+        </w:rPr>
+        <w:t>It was the only thing he said. His voice was ordinary and a little hoarse, a voice nobody would have looked up for in a canteen queue.</w:t>
+      </w:r>
+    </w:p>
+    <w:p>
+      <w:r>
+        <w:rPr>
+          <w:b w:val="0"/>
+          <w:i w:val="0"/>
+          <w:strike w:val="0"/>
+        </w:rPr>
+        <w:t>They sat a while longer. Then the porter stood, crossed to the door, and held it with his heel. He didn't offer his hand. Ravi went out past him with the folio back inside his coat, still shut, and behind him the wired glass laid its diamonds over an empty chair.</w:t>
+      </w:r>
+    </w:p>
+    <w:p>
+      <w:r>
+        <w:rPr>
+          <w:b w:val="0"/>
+          <w:i w:val="0"/>
+          <w:strike w:val="0"/>
+        </w:rPr>
+        <w:t>---</w:t>
       </w:r>
     </w:p>
     <w:p>

</xml_diff>